<commit_message>
docs: guide updated for vacant slots, the detail dialog and staff cancels
Rewritten against the code as it stands: quản sinh now cancels directly,
the colour table gains the dashed 'còn trống' card, lịch huỷ is grey
rather than red, and a new section covers what each audience sees when
they open a card.
</commit_message>
<xml_diff>
--- a/docs/Huong-dan-su-dung-Quan-sinh.docx
+++ b/docs/Huong-dan-su-dung-Quan-sinh.docx
@@ -217,7 +217,7 @@
           <w:p>
             <w:r/>
             <w:r>
-              <w:t>Thẻ màu đỏ, không cần ai báo</w:t>
+              <w:t>Thẻ màu xám, không cần ai báo</w:t>
             </w:r>
           </w:p>
         </w:tc>
@@ -410,7 +410,7 @@
           <w:p>
             <w:r/>
             <w:r>
-              <w:t>Không</w:t>
+              <w:t>Có</w:t>
             </w:r>
           </w:p>
         </w:tc>
@@ -421,7 +421,7 @@
           <w:p>
             <w:r/>
             <w:r>
-              <w:t>Chỉ Admin</w:t>
+              <w:t>Huỷ thẳng, không cần duyệt</w:t>
             </w:r>
           </w:p>
         </w:tc>
@@ -896,7 +896,7 @@
         <w:tc>
           <w:tcPr>
             <w:tcW w:type="dxa" w:w="1440"/>
-            <w:shd w:val="clear" w:fill="FCE4E4"/>
+            <w:shd w:val="clear" w:fill="FBF3E4"/>
           </w:tcPr>
           <w:p>
             <w:r/>
@@ -904,9 +904,50 @@
             <w:r>
               <w:rPr>
                 <w:b/>
-                <w:color w:val="D90513"/>
+                <w:color w:val="8F5B0D"/>
               </w:rPr>
-              <w:t xml:space="preserve"> Đỏ</w:t>
+              <w:t xml:space="preserve"> Vàng nhạt</w:t>
+            </w:r>
+          </w:p>
+        </w:tc>
+        <w:tc>
+          <w:tcPr>
+            <w:tcW w:type="dxa" w:w="2736"/>
+          </w:tcPr>
+          <w:p>
+            <w:r/>
+            <w:r>
+              <w:t>Lịch cố định — còn trống</w:t>
+            </w:r>
+          </w:p>
+        </w:tc>
+        <w:tc>
+          <w:tcPr>
+            <w:tcW w:type="dxa" w:w="5040"/>
+          </w:tcPr>
+          <w:p>
+            <w:r/>
+            <w:r>
+              <w:t>Chỗ cố định đã có người trả lại, đang chờ bạn khác (viền nét đứt)</w:t>
+            </w:r>
+          </w:p>
+        </w:tc>
+      </w:tr>
+      <w:tr>
+        <w:tc>
+          <w:tcPr>
+            <w:tcW w:type="dxa" w:w="1440"/>
+            <w:shd w:val="clear" w:fill="EFEFEF"/>
+          </w:tcPr>
+          <w:p>
+            <w:r/>
+            <w:r/>
+            <w:r>
+              <w:rPr>
+                <w:b/>
+                <w:color w:val="606060"/>
+              </w:rPr>
+              <w:t xml:space="preserve"> Xám</w:t>
             </w:r>
           </w:p>
         </w:tc>
@@ -951,7 +992,16 @@
           <w:color w:val="606060"/>
           <w:sz w:val="20"/>
         </w:rPr>
-        <w:t>Lịch cố định có hiệu lực ngay khi đăng ký, không cần ai duyệt. Chỉ việc HUỶ lịch mới cần Admin duyệt.</w:t>
+        <w:t>Lịch cố định có hiệu lực ngay khi đăng ký, không cần ai duyệt. Học sinh muốn huỷ thì phải gửi yêu cầu cho Admin duyệt; Quản sinh và Admin huỷ thẳng được.</w:t>
+      </w:r>
+    </w:p>
+    <w:p>
+      <w:r>
+        <w:rPr>
+          <w:i w:val="0"/>
+          <w:sz w:val="22"/>
+        </w:rPr>
+        <w:t>Khi một lịch cố định được duyệt cho huỷ, chỗ đó KHÔNG biến mất mà giữ lại dạng viền nét đứt, không hiện tên. Bạn nào đăng ký đúng chỗ và khung giờ đó sẽ nhận luôn lịch cố định hằng tuần.</w:t>
       </w:r>
     </w:p>
     <w:p>
@@ -1058,7 +1108,55 @@
           <w:color w:val="1E3A8A"/>
           <w:sz w:val="28"/>
         </w:rPr>
-        <w:t>6. Dashboard thống kê</w:t>
+        <w:t>6. Xem chi tiết một lịch</w:t>
+      </w:r>
+    </w:p>
+    <w:p>
+      <w:r>
+        <w:rPr>
+          <w:i w:val="0"/>
+          <w:sz w:val="22"/>
+        </w:rPr>
+        <w:t>Bấm vào thẻ lịch bất kỳ để xem chi tiết: họ tên, lớp, số điện thoại, cơ sở, chỗ ngồi, ngày giờ và loại lịch.</w:t>
+      </w:r>
+    </w:p>
+    <w:p>
+      <w:pPr>
+        <w:pStyle w:val="ListBullet"/>
+      </w:pPr>
+      <w:r>
+        <w:t>Quản sinh và Admin đều xem được đầy đủ, kể cả số điện thoại.</w:t>
+      </w:r>
+    </w:p>
+    <w:p>
+      <w:pPr>
+        <w:pStyle w:val="ListBullet"/>
+      </w:pPr>
+      <w:r>
+        <w:t>Trong hộp thoại có nút Huỷ đăng ký — huỷ thẳng, không cần ai duyệt.</w:t>
+      </w:r>
+    </w:p>
+    <w:p>
+      <w:r>
+        <w:rPr>
+          <w:i/>
+          <w:color w:val="606060"/>
+          <w:sz w:val="20"/>
+        </w:rPr>
+        <w:t>Học sinh xem trên trang ngoài chỉ thấy số điện thoại của lịch do chính máy họ đặt. Lịch của bạn khác thì họ chỉ xem được và có cảnh báo rõ, không huỷ được.</w:t>
+      </w:r>
+    </w:p>
+    <w:p>
+      <w:pPr>
+        <w:spacing w:before="280" w:after="80"/>
+      </w:pPr>
+      <w:r>
+        <w:rPr>
+          <w:b/>
+          <w:color w:val="1E3A8A"/>
+          <w:sz w:val="28"/>
+        </w:rPr>
+        <w:t>7. Dashboard thống kê</w:t>
       </w:r>
     </w:p>
     <w:p>
@@ -1080,7 +1178,7 @@
           <w:color w:val="1E3A8A"/>
           <w:sz w:val="28"/>
         </w:rPr>
-        <w:t>7. Thông báo</w:t>
+        <w:t>8. Thông báo</w:t>
       </w:r>
     </w:p>
     <w:p>
@@ -1134,7 +1232,7 @@
           <w:color w:val="1E3A8A"/>
           <w:sz w:val="28"/>
         </w:rPr>
-        <w:t>8. Những việc cần chuyển cho Admin</w:t>
+        <w:t>9. Những việc cần chuyển cho Admin</w:t>
       </w:r>
     </w:p>
     <w:p>
@@ -1144,14 +1242,6 @@
           <w:sz w:val="22"/>
         </w:rPr>
         <w:t>Quản sinh không thao tác được các việc sau. Khi cần, hãy báo Admin:</w:t>
-      </w:r>
-    </w:p>
-    <w:p>
-      <w:pPr>
-        <w:pStyle w:val="ListBullet"/>
-      </w:pPr>
-      <w:r>
-        <w:t>Huỷ lịch của học sinh</w:t>
       </w:r>
     </w:p>
     <w:p>
@@ -1196,7 +1286,7 @@
           <w:color w:val="1E3A8A"/>
           <w:sz w:val="28"/>
         </w:rPr>
-        <w:t>9. Câu hỏi thường gặp</w:t>
+        <w:t>10. Câu hỏi thường gặp</w:t>
       </w:r>
     </w:p>
     <w:p>
@@ -1226,7 +1316,7 @@
           <w:i w:val="0"/>
           <w:sz w:val="22"/>
         </w:rPr>
-        <w:t>Vì sao bấm vào một thẻ lịch đã có người thì không làm được gì?</w:t>
+        <w:t>Thẻ viền nét đứt, không có tên là gì?</w:t>
       </w:r>
     </w:p>
     <w:p>
@@ -1235,7 +1325,7 @@
           <w:i w:val="0"/>
           <w:sz w:val="20"/>
         </w:rPr>
-        <w:t>Quản sinh đặt hộ được nhưng không huỷ được. Bấm vào ô trống thì đặt lịch bình thường.</w:t>
+        <w:t>Là chỗ cố định vừa có người trả lại. Ai đăng ký vào đó sẽ nhận luôn lịch cố định hằng tuần.</w:t>
       </w:r>
     </w:p>
     <w:p/>
@@ -1255,7 +1345,7 @@
           <w:i w:val="0"/>
           <w:sz w:val="20"/>
         </w:rPr>
-        <w:t>Học sinh gửi yêu cầu huỷ trên trang ngoài, Admin duyệt. Quản sinh không huỷ trực tiếp được.</w:t>
+        <w:t>Bấm vào thẻ lịch đó rồi bấm Huỷ đăng ký. Nếu học sinh tự huỷ trên trang ngoài thì phải chờ Admin duyệt.</w:t>
       </w:r>
     </w:p>
     <w:p/>

</xml_diff>